<commit_message>
test(fixtures): add fixtures for all supported document formats
Expand test fixtures from 5 formats (pdf, docx, txt, mp3, wav) to
cover all 17 supported formats: pptx, xlsx, html, md, csv, asciidoc,
vtt, png, jpg, tiff, bmp, webp. Update generator and validator.
</commit_message>
<xml_diff>
--- a/tests/fixtures/sample.docx
+++ b/tests/fixtures/sample.docx
@@ -62,12 +62,7 @@
     </w:p>
     <w:p>
       <w:r>
-        <w:t>Expected behavior: DOCX files are text-only format in the processing pipeline. They should generate text chunks but no visual/page embeddings.</w:t>
-      </w:r>
-    </w:p>
-    <w:p>
-      <w:r>
-        <w:t>The Docling parser extracts text content and structure from DOCX files, which is then processed by the text embedding handler.</w:t>
+        <w:t>Expected behavior: DOCX files should generate text chunks. The Docling parser extracts text content and structure.</w:t>
       </w:r>
     </w:p>
     <w:sectPr>

</xml_diff>